<commit_message>
fixed numbering and added filter instructions
</commit_message>
<xml_diff>
--- a/Rally_Scoring_Install_Guide.docx
+++ b/Rally_Scoring_Install_Guide.docx
@@ -2568,7 +2568,7 @@
                 <w:sz w:val="32"/>
                 <w:szCs w:val="32"/>
               </w:rPr>
-              <w:t xml:space="preserve">2</w:t>
+              <w:t xml:space="preserve">2a</w:t>
             </w:r>
           </w:p>
         </w:tc>
@@ -2828,7 +2828,7 @@
                 <w:sz w:val="32"/>
                 <w:szCs w:val="32"/>
               </w:rPr>
-              <w:t xml:space="preserve">3</w:t>
+              <w:t xml:space="preserve">2b</w:t>
             </w:r>
           </w:p>
         </w:tc>
@@ -3122,7 +3122,7 @@
                 <w:sz w:val="32"/>
                 <w:szCs w:val="32"/>
               </w:rPr>
-              <w:t xml:space="preserve">4</w:t>
+              <w:t xml:space="preserve">2c</w:t>
             </w:r>
           </w:p>
         </w:tc>
@@ -3412,7 +3412,7 @@
                 <w:sz w:val="32"/>
                 <w:szCs w:val="32"/>
               </w:rPr>
-              <w:t xml:space="preserve">5</w:t>
+              <w:t xml:space="preserve">3</w:t>
             </w:r>
           </w:p>
         </w:tc>
@@ -3771,7 +3771,7 @@
                 <w:sz w:val="32"/>
                 <w:szCs w:val="32"/>
               </w:rPr>
-              <w:t xml:space="preserve">6</w:t>
+              <w:t xml:space="preserve">4</w:t>
             </w:r>
           </w:p>
         </w:tc>
@@ -3950,7 +3950,7 @@
           <w:sz w:val="26"/>
           <w:szCs w:val="26"/>
         </w:rPr>
-        <w:t xml:space="preserve">Step 5 — Set Up a Gmail Filter (Recommended)</w:t>
+        <w:t xml:space="preserve">Step 5 — Set Up Gmail Filters (Recommended)</w:t>
       </w:r>
     </w:p>
     <w:p>
@@ -3964,7 +3964,7 @@
           <w:sz w:val="22"/>
           <w:szCs w:val="22"/>
         </w:rPr>
-        <w:t xml:space="preserve">A filter automatically tags incoming submissions as unprocessed so nothing gets missed:</w:t>
+        <w:t xml:space="preserve">Create two filters so incoming submissions are automatically labelled the moment they arrive — no manual work needed.</w:t>
       </w:r>
     </w:p>
     <w:p>
@@ -4024,7 +4024,7 @@
                 <w:sz w:val="32"/>
                 <w:szCs w:val="32"/>
               </w:rPr>
-              <w:t xml:space="preserve">7</w:t>
+              <w:t xml:space="preserve">5a</w:t>
             </w:r>
           </w:p>
         </w:tc>
@@ -4058,7 +4058,7 @@
                 <w:sz w:val="22"/>
                 <w:szCs w:val="22"/>
               </w:rPr>
-              <w:t xml:space="preserve">Create a Gmail filter</w:t>
+              <w:t xml:space="preserve">Filter 1: Apply the rally parent label</w:t>
             </w:r>
           </w:p>
           <w:p>
@@ -4077,7 +4077,7 @@
                 <w:sz w:val="22"/>
                 <w:szCs w:val="22"/>
               </w:rPr>
-              <w:t xml:space="preserve">In Gmail, click the search bar then the filter icon on the right</w:t>
+              <w:t xml:space="preserve">In Gmail, click the search bar then click the filter icon on the right side of the search bar</w:t>
             </w:r>
           </w:p>
           <w:p>
@@ -4097,6 +4097,250 @@
                 <w:szCs w:val="22"/>
               </w:rPr>
               <w:t xml:space="preserve">In the To field, enter your scoring email address</w:t>
+            </w:r>
+          </w:p>
+          <w:p>
+            <w:pPr>
+              <w:pStyle w:val="ListParagraph"/>
+              <w:numPr>
+                <w:ilvl w:val="0"/>
+                <w:numId w:val="3"/>
+              </w:numPr>
+              <w:spacing w:after="60" w:before="60"/>
+            </w:pPr>
+            <w:r>
+              <w:rPr>
+                <w:rFonts w:ascii="Arial" w:cs="Arial" w:eastAsia="Arial" w:hAnsi="Arial"/>
+                <w:color w:val="1A1A1A"/>
+                <w:sz w:val="22"/>
+                <w:szCs w:val="22"/>
+              </w:rPr>
+              <w:t xml:space="preserve">Click Create filter</w:t>
+            </w:r>
+          </w:p>
+          <w:p>
+            <w:pPr>
+              <w:pStyle w:val="ListParagraph"/>
+              <w:numPr>
+                <w:ilvl w:val="0"/>
+                <w:numId w:val="3"/>
+              </w:numPr>
+              <w:spacing w:after="60" w:before="60"/>
+            </w:pPr>
+            <w:r>
+              <w:rPr>
+                <w:rFonts w:ascii="Arial" w:cs="Arial" w:eastAsia="Arial" w:hAnsi="Arial"/>
+                <w:b w:val="false"/>
+                <w:bCs w:val="false"/>
+                <w:i w:val="false"/>
+                <w:iCs w:val="false"/>
+                <w:color w:val="1A1A1A"/>
+                <w:sz w:val="22"/>
+                <w:szCs w:val="22"/>
+              </w:rPr>
+              <w:t xml:space="preserve">Check </w:t>
+            </w:r>
+            <w:r>
+              <w:rPr>
+                <w:rFonts w:ascii="Arial" w:cs="Arial" w:eastAsia="Arial" w:hAnsi="Arial"/>
+                <w:b/>
+                <w:bCs/>
+                <w:i w:val="false"/>
+                <w:iCs w:val="false"/>
+                <w:color w:val="1A1A1A"/>
+                <w:sz w:val="22"/>
+                <w:szCs w:val="22"/>
+              </w:rPr>
+              <w:t xml:space="preserve">Apply the label</w:t>
+            </w:r>
+            <w:r>
+              <w:rPr>
+                <w:rFonts w:ascii="Arial" w:cs="Arial" w:eastAsia="Arial" w:hAnsi="Arial"/>
+                <w:b w:val="false"/>
+                <w:bCs w:val="false"/>
+                <w:i w:val="false"/>
+                <w:iCs w:val="false"/>
+                <w:color w:val="1A1A1A"/>
+                <w:sz w:val="22"/>
+                <w:szCs w:val="22"/>
+              </w:rPr>
+              <w:t xml:space="preserve"> and choose </w:t>
+            </w:r>
+            <w:r>
+              <w:rPr>
+                <w:rFonts w:ascii="Courier New" w:cs="Courier New" w:eastAsia="Courier New" w:hAnsi="Courier New"/>
+                <w:color w:val="1A56AA"/>
+                <w:sz w:val="20"/>
+                <w:szCs w:val="20"/>
+              </w:rPr>
+              <w:t xml:space="preserve">rally</w:t>
+            </w:r>
+            <w:r>
+              <w:rPr>
+                <w:rFonts w:ascii="Arial" w:cs="Arial" w:eastAsia="Arial" w:hAnsi="Arial"/>
+                <w:b w:val="false"/>
+                <w:bCs w:val="false"/>
+                <w:i w:val="false"/>
+                <w:iCs w:val="false"/>
+                <w:color w:val="1A1A1A"/>
+                <w:sz w:val="22"/>
+                <w:szCs w:val="22"/>
+              </w:rPr>
+              <w:t xml:space="preserve"> (the bare parent label)</w:t>
+            </w:r>
+          </w:p>
+          <w:p>
+            <w:pPr>
+              <w:pStyle w:val="ListParagraph"/>
+              <w:numPr>
+                <w:ilvl w:val="0"/>
+                <w:numId w:val="3"/>
+              </w:numPr>
+              <w:spacing w:after="60" w:before="60"/>
+            </w:pPr>
+            <w:r>
+              <w:rPr>
+                <w:rFonts w:ascii="Arial" w:cs="Arial" w:eastAsia="Arial" w:hAnsi="Arial"/>
+                <w:color w:val="1A1A1A"/>
+                <w:sz w:val="22"/>
+                <w:szCs w:val="22"/>
+              </w:rPr>
+              <w:t xml:space="preserve">Click Create filter</w:t>
+            </w:r>
+          </w:p>
+        </w:tc>
+      </w:tr>
+    </w:tbl>
+    <w:p>
+      <w:pPr>
+        <w:spacing w:after="120" w:before="0"/>
+      </w:pPr>
+      <w:r>
+        <w:t xml:space="preserve"/>
+      </w:r>
+    </w:p>
+    <w:tbl>
+      <w:tblPr>
+        <w:tblW w:type="dxa" w:w="9360"/>
+        <w:tblBorders>
+          <w:top w:val="single" w:color="auto" w:sz="4"/>
+          <w:left w:val="single" w:color="auto" w:sz="4"/>
+          <w:bottom w:val="single" w:color="auto" w:sz="4"/>
+          <w:right w:val="single" w:color="auto" w:sz="4"/>
+          <w:insideH w:val="single" w:color="auto" w:sz="4"/>
+          <w:insideV w:val="single" w:color="auto" w:sz="4"/>
+        </w:tblBorders>
+      </w:tblPr>
+      <w:tblGrid>
+        <w:gridCol w:w="700"/>
+        <w:gridCol w:w="8660"/>
+      </w:tblGrid>
+      <w:tr>
+        <w:tc>
+          <w:tcPr>
+            <w:tcW w:type="dxa" w:w="700"/>
+            <w:tcBorders>
+              <w:top w:val="none" w:color="FFFFFF" w:sz="0"/>
+              <w:left w:val="none" w:color="FFFFFF" w:sz="0"/>
+              <w:bottom w:val="none" w:color="FFFFFF" w:sz="0"/>
+              <w:right w:val="none" w:color="FFFFFF" w:sz="0"/>
+            </w:tcBorders>
+            <w:shd w:fill="1A56AA" w:val="clear"/>
+            <w:tcMar>
+              <w:top w:type="dxa" w:w="120"/>
+              <w:left w:type="dxa" w:w="120"/>
+              <w:bottom w:type="dxa" w:w="120"/>
+              <w:right w:type="dxa" w:w="120"/>
+            </w:tcMar>
+            <w:vAlign w:val="center"/>
+          </w:tcPr>
+          <w:p>
+            <w:pPr>
+              <w:spacing w:after="0" w:before="0"/>
+              <w:jc w:val="center"/>
+            </w:pPr>
+            <w:r>
+              <w:rPr>
+                <w:rFonts w:ascii="Arial" w:cs="Arial" w:eastAsia="Arial" w:hAnsi="Arial"/>
+                <w:b/>
+                <w:bCs/>
+                <w:color w:val="FFFFFF"/>
+                <w:sz w:val="32"/>
+                <w:szCs w:val="32"/>
+              </w:rPr>
+              <w:t xml:space="preserve">5b</w:t>
+            </w:r>
+          </w:p>
+        </w:tc>
+        <w:tc>
+          <w:tcPr>
+            <w:tcW w:type="dxa" w:w="8660"/>
+            <w:tcBorders>
+              <w:top w:val="single" w:color="CCCCCC" w:sz="1"/>
+              <w:left w:val="none" w:color="FFFFFF" w:sz="0"/>
+              <w:bottom w:val="single" w:color="CCCCCC" w:sz="1"/>
+              <w:right w:val="single" w:color="CCCCCC" w:sz="1"/>
+            </w:tcBorders>
+            <w:shd w:fill="E8F0FB" w:val="clear"/>
+            <w:tcMar>
+              <w:top w:type="dxa" w:w="120"/>
+              <w:left w:type="dxa" w:w="160"/>
+              <w:bottom w:type="dxa" w:w="120"/>
+              <w:right w:type="dxa" w:w="160"/>
+            </w:tcMar>
+          </w:tcPr>
+          <w:p>
+            <w:pPr>
+              <w:spacing w:after="60" w:before="0"/>
+            </w:pPr>
+            <w:r>
+              <w:rPr>
+                <w:rFonts w:ascii="Arial" w:cs="Arial" w:eastAsia="Arial" w:hAnsi="Arial"/>
+                <w:b/>
+                <w:bCs/>
+                <w:color w:val="1A1A1A"/>
+                <w:sz w:val="22"/>
+                <w:szCs w:val="22"/>
+              </w:rPr>
+              <w:t xml:space="preserve">Filter 2: Apply the rally/unprocessed label</w:t>
+            </w:r>
+          </w:p>
+          <w:p>
+            <w:pPr>
+              <w:pStyle w:val="ListParagraph"/>
+              <w:numPr>
+                <w:ilvl w:val="0"/>
+                <w:numId w:val="3"/>
+              </w:numPr>
+              <w:spacing w:after="60" w:before="60"/>
+            </w:pPr>
+            <w:r>
+              <w:rPr>
+                <w:rFonts w:ascii="Arial" w:cs="Arial" w:eastAsia="Arial" w:hAnsi="Arial"/>
+                <w:color w:val="1A1A1A"/>
+                <w:sz w:val="22"/>
+                <w:szCs w:val="22"/>
+              </w:rPr>
+              <w:t xml:space="preserve">In Gmail, click the search bar then click the filter icon again</w:t>
+            </w:r>
+          </w:p>
+          <w:p>
+            <w:pPr>
+              <w:pStyle w:val="ListParagraph"/>
+              <w:numPr>
+                <w:ilvl w:val="0"/>
+                <w:numId w:val="3"/>
+              </w:numPr>
+              <w:spacing w:after="60" w:before="60"/>
+            </w:pPr>
+            <w:r>
+              <w:rPr>
+                <w:rFonts w:ascii="Arial" w:cs="Arial" w:eastAsia="Arial" w:hAnsi="Arial"/>
+                <w:color w:val="1A1A1A"/>
+                <w:sz w:val="22"/>
+                <w:szCs w:val="22"/>
+              </w:rPr>
+              <w:t xml:space="preserve">In the To field, enter your scoring email address again (same address)</w:t>
             </w:r>
           </w:p>
           <w:p>
@@ -4252,16 +4496,16 @@
                 <w:sz w:val="20"/>
                 <w:szCs w:val="20"/>
               </w:rPr>
-              <w:t xml:space="preserve">Why this matters:  </w:t>
-            </w:r>
-            <w:r>
-              <w:rPr>
-                <w:rFonts w:ascii="Arial" w:cs="Arial" w:eastAsia="Arial" w:hAnsi="Arial"/>
-                <w:color w:val="1A1A1A"/>
-                <w:sz w:val="20"/>
-                <w:szCs w:val="20"/>
-              </w:rPr>
-              <w:t xml:space="preserve">Without the filter you would need to manually apply rally/unprocessed to each incoming submission. The filter does it automatically the moment an email arrives.</w:t>
+              <w:t xml:space="preserve">Why two filters?  </w:t>
+            </w:r>
+            <w:r>
+              <w:rPr>
+                <w:rFonts w:ascii="Arial" w:cs="Arial" w:eastAsia="Arial" w:hAnsi="Arial"/>
+                <w:color w:val="1A1A1A"/>
+                <w:sz w:val="20"/>
+                <w:szCs w:val="20"/>
+              </w:rPr>
+              <w:t xml:space="preserve">Gmail requires a separate filter for each label. The first adds the bare rally parent label so the email appears under rally in the sidebar. The second adds rally/unprocessed so the script picks it up on its next run. Both filters trigger on the same incoming emails.</w:t>
             </w:r>
           </w:p>
         </w:tc>
@@ -5353,7 +5597,7 @@
                 <w:sz w:val="32"/>
                 <w:szCs w:val="32"/>
               </w:rPr>
-              <w:t xml:space="preserve">8</w:t>
+              <w:t xml:space="preserve">1</w:t>
             </w:r>
           </w:p>
         </w:tc>
@@ -5407,7 +5651,7 @@
               </w:rPr>
               <w:t xml:space="preserve">Go to </w:t>
             </w:r>
-            <w:hyperlink w:history="1" r:id="rId9iulma8pczjqnofx4simw">
+            <w:hyperlink w:history="1" r:id="rIdeewtm8s9e3mrb6-tvxabj">
               <w:r>
                 <w:rPr>
                   <w:rFonts w:ascii="Arial" w:cs="Arial" w:eastAsia="Arial" w:hAnsi="Arial"/>
@@ -5604,7 +5848,7 @@
                 <w:sz w:val="32"/>
                 <w:szCs w:val="32"/>
               </w:rPr>
-              <w:t xml:space="preserve">9</w:t>
+              <w:t xml:space="preserve">2</w:t>
             </w:r>
           </w:p>
         </w:tc>
@@ -5864,7 +6108,7 @@
                 <w:sz w:val="32"/>
                 <w:szCs w:val="32"/>
               </w:rPr>
-              <w:t xml:space="preserve">10</w:t>
+              <w:t xml:space="preserve">3</w:t>
             </w:r>
           </w:p>
         </w:tc>

</xml_diff>